<commit_message>
1.0.20 batch, part 6: analytics legend and week cards readable (A572); wording by business type - Departments for shops, Groups for parking and other, no restaurant screens for shops (A573); every label carries a barcode, missing codes generated at print, barcode numbering settings (A574); shop wording in analytics and what sells together (A575, migration 164); menus by time of day with scans refused outside hours (A578, migration 165, local schema 76); loss-prevention watch list and alerts (A576, migration 166); items sold by weight with scale labels and a weight keypad (A577, migration 167, local schema 77); technician setup guide 1.1; website night 2
</commit_message>
<xml_diff>
--- a/docs/Manuals/BARCODE-LABELS.docx
+++ b/docs/Manuals/BARCODE-LABELS.docx
@@ -85,6 +85,26 @@
     </w:p>
     <w:p>
       <w:pPr>
+        <w:pBdr>
+          <w:left w:val="single" w:color="F59E0B" w:sz="24" w:space="8"/>
+        </w:pBdr>
+        <w:shd w:fill="FFF7E6" w:color="auto" w:val="clear"/>
+        <w:spacing w:before="120" w:after="120"/>
+        <w:ind w:left="200"/>
+      </w:pPr>
+      <w:r>
+        <w:rPr>
+          <w:b/>
+          <w:bCs/>
+        </w:rPr>
+        <w:t xml:space="preserve">Every label has a barcode.</w:t>
+      </w:r>
+      <w:r>
+        <w:t xml:space="preserve"> You cannot print a label without one. If an item you choose has no barcode yet, ZapTill gives it one when you print (section 3).</w:t>
+      </w:r>
+    </w:p>
+    <w:p>
+      <w:pPr>
         <w:pStyle w:val="Heading1"/>
       </w:pPr>
       <w:r>
@@ -275,7 +295,7 @@
         <w:t xml:space="preserve">About the codes.</w:t>
       </w:r>
       <w:r>
-        <w:t xml:space="preserve"> They are 13-digit EAN-13 codes that start with </w:t>
+        <w:t xml:space="preserve"> Unless you change the numbering (below), they are 13-digit EAN-13 codes that start with </w:t>
       </w:r>
       <w:r>
         <w:rPr>
@@ -297,7 +317,7 @@
         <w:t xml:space="preserve">2000000000015</w:t>
       </w:r>
       <w:r>
-        <w:t xml:space="preserve">. GS1, the body that issues barcodes, keeps codes starting with 20 to 29 for a shop's own use: no manufacturer's product carries one, so your codes never clash with a real product's. ZapTill uses only </w:t>
+        <w:t xml:space="preserve">. GS1, the body that issues barcodes, keeps codes starting with 20 to 29 for a shop's own use: no manufacturer's product carries one, so your codes never clash with a real product's. Codes starting with 21 to 29 are often used by weighing scales that print the price or weight inside the barcode, so </w:t>
       </w:r>
       <w:r>
         <w:rPr>
@@ -307,7 +327,7 @@
         <w:t xml:space="preserve">20</w:t>
       </w:r>
       <w:r>
-        <w:t xml:space="preserve">. Codes starting with 21 to 29 are left free for weighing scales that print the price or weight inside the barcode.</w:t>
+        <w:t xml:space="preserve"> is the safe choice.</w:t>
       </w:r>
     </w:p>
     <w:p>
@@ -361,11 +381,10 @@
     </w:p>
     <w:p>
       <w:pPr>
-        <w:pStyle w:val="Heading1"/>
-        <w:pageBreakBefore/>
-      </w:pPr>
-      <w:r>
-        <w:t xml:space="preserve">2. The label</w:t>
+        <w:pStyle w:val="Heading2"/>
+      </w:pPr>
+      <w:r>
+        <w:t xml:space="preserve">Barcode numbering: format, prefix, start number, digits</w:t>
       </w:r>
     </w:p>
     <w:p>
@@ -373,7 +392,17 @@
         <w:spacing w:after="120"/>
       </w:pPr>
       <w:r>
-        <w:t xml:space="preserve">On the web the label is set on </w:t>
+        <w:t xml:space="preserve">You choose how new barcodes are made. On the web it is the </w:t>
+      </w:r>
+      <w:r>
+        <w:rPr>
+          <w:b/>
+          <w:bCs/>
+        </w:rPr>
+        <w:t xml:space="preserve">Barcode numbering</w:t>
+      </w:r>
+      <w:r>
+        <w:t xml:space="preserve"> section of </w:t>
       </w:r>
       <w:r>
         <w:rPr>
@@ -383,7 +412,7 @@
         <w:t xml:space="preserve">Menu › Print labels</w:t>
       </w:r>
       <w:r>
-        <w:t xml:space="preserve">. On the till it is set on </w:t>
+        <w:t xml:space="preserve">; on the till it is the same section on </w:t>
       </w:r>
       <w:r>
         <w:rPr>
@@ -393,17 +422,7 @@
         <w:t xml:space="preserve">Manager › Stock › Labels</w:t>
       </w:r>
       <w:r>
-        <w:t xml:space="preserve">. Both screens use the same settings. When someone allowed to edit the menu clicks </w:t>
-      </w:r>
-      <w:r>
-        <w:rPr>
-          <w:b/>
-          <w:bCs/>
-        </w:rPr>
-        <w:t xml:space="preserve">Save</w:t>
-      </w:r>
-      <w:r>
-        <w:t xml:space="preserve">, every till and the web use the new settings.</w:t>
+        <w:t xml:space="preserve">. Changing it needs the right to edit the menu, and the till needs the internet to save it. Everyone else sees it but cannot change it.</w:t>
       </w:r>
     </w:p>
     <w:tbl>
@@ -419,8 +438,8 @@
         </w:tblBorders>
       </w:tblPr>
       <w:tblGrid>
-        <w:gridCol w:w="1621"/>
-        <w:gridCol w:w="8017"/>
+        <w:gridCol w:w="1524"/>
+        <w:gridCol w:w="8114"/>
       </w:tblGrid>
       <w:tr>
         <w:trPr>
@@ -428,7 +447,7 @@
         </w:trPr>
         <w:tc>
           <w:tcPr>
-            <w:tcW w:type="dxa" w:w="1621"/>
+            <w:tcW w:type="dxa" w:w="1524"/>
             <w:tcBorders>
               <w:top w:val="single" w:color="D1D5DB" w:sz="4"/>
               <w:left w:val="single" w:color="D1D5DB" w:sz="4"/>
@@ -457,7 +476,7 @@
         </w:tc>
         <w:tc>
           <w:tcPr>
-            <w:tcW w:type="dxa" w:w="8017"/>
+            <w:tcW w:type="dxa" w:w="8114"/>
             <w:tcBorders>
               <w:top w:val="single" w:color="D1D5DB" w:sz="4"/>
               <w:left w:val="single" w:color="D1D5DB" w:sz="4"/>
@@ -488,53 +507,110 @@
       <w:tr>
         <w:tc>
           <w:tcPr>
-            <w:tcW w:type="dxa" w:w="1621"/>
-            <w:tcBorders>
-              <w:top w:val="single" w:color="D1D5DB" w:sz="4"/>
-              <w:left w:val="single" w:color="D1D5DB" w:sz="4"/>
-              <w:bottom w:val="single" w:color="D1D5DB" w:sz="4"/>
-              <w:right w:val="single" w:color="D1D5DB" w:sz="4"/>
-            </w:tcBorders>
-            <w:tcMar>
-              <w:top w:type="dxa" w:w="60"/>
-              <w:left w:type="dxa" w:w="100"/>
-              <w:bottom w:type="dxa" w:w="60"/>
-              <w:right w:type="dxa" w:w="100"/>
-            </w:tcMar>
-          </w:tcPr>
-          <w:p>
-            <w:r>
-              <w:rPr>
-                <w:sz w:val="19"/>
-                <w:szCs w:val="19"/>
-              </w:rPr>
-              <w:t xml:space="preserve">Size</w:t>
-            </w:r>
-          </w:p>
-        </w:tc>
-        <w:tc>
-          <w:tcPr>
-            <w:tcW w:type="dxa" w:w="8017"/>
-            <w:tcBorders>
-              <w:top w:val="single" w:color="D1D5DB" w:sz="4"/>
-              <w:left w:val="single" w:color="D1D5DB" w:sz="4"/>
-              <w:bottom w:val="single" w:color="D1D5DB" w:sz="4"/>
-              <w:right w:val="single" w:color="D1D5DB" w:sz="4"/>
-            </w:tcBorders>
-            <w:tcMar>
-              <w:top w:type="dxa" w:w="60"/>
-              <w:left w:type="dxa" w:w="100"/>
-              <w:bottom w:type="dxa" w:w="60"/>
-              <w:right w:type="dxa" w:w="100"/>
-            </w:tcMar>
-          </w:tcPr>
-          <w:p>
-            <w:r>
-              <w:rPr>
-                <w:sz w:val="19"/>
-                <w:szCs w:val="19"/>
-              </w:rPr>
-              <w:t xml:space="preserve">30×20, 38×25, 40×30, 50×25, 50×30, 58×40 or 60×40 mm, or type any width × height. Measure one label on the roll, without the gap.</w:t>
+            <w:tcW w:type="dxa" w:w="1524"/>
+            <w:tcBorders>
+              <w:top w:val="single" w:color="D1D5DB" w:sz="4"/>
+              <w:left w:val="single" w:color="D1D5DB" w:sz="4"/>
+              <w:bottom w:val="single" w:color="D1D5DB" w:sz="4"/>
+              <w:right w:val="single" w:color="D1D5DB" w:sz="4"/>
+            </w:tcBorders>
+            <w:tcMar>
+              <w:top w:type="dxa" w:w="60"/>
+              <w:left w:type="dxa" w:w="100"/>
+              <w:bottom w:type="dxa" w:w="60"/>
+              <w:right w:type="dxa" w:w="100"/>
+            </w:tcMar>
+          </w:tcPr>
+          <w:p>
+            <w:r>
+              <w:rPr>
+                <w:sz w:val="19"/>
+                <w:szCs w:val="19"/>
+              </w:rPr>
+              <w:t xml:space="preserve">Format</w:t>
+            </w:r>
+          </w:p>
+        </w:tc>
+        <w:tc>
+          <w:tcPr>
+            <w:tcW w:type="dxa" w:w="8114"/>
+            <w:tcBorders>
+              <w:top w:val="single" w:color="D1D5DB" w:sz="4"/>
+              <w:left w:val="single" w:color="D1D5DB" w:sz="4"/>
+              <w:bottom w:val="single" w:color="D1D5DB" w:sz="4"/>
+              <w:right w:val="single" w:color="D1D5DB" w:sz="4"/>
+            </w:tcBorders>
+            <w:tcMar>
+              <w:top w:type="dxa" w:w="60"/>
+              <w:left w:type="dxa" w:w="100"/>
+              <w:bottom w:type="dxa" w:w="60"/>
+              <w:right w:type="dxa" w:w="100"/>
+            </w:tcMar>
+          </w:tcPr>
+          <w:p>
+            <w:r>
+              <w:rPr>
+                <w:b/>
+                <w:bCs/>
+                <w:sz w:val="19"/>
+                <w:szCs w:val="19"/>
+              </w:rPr>
+              <w:t xml:space="preserve">EAN-13</w:t>
+            </w:r>
+            <w:r>
+              <w:rPr>
+                <w:sz w:val="19"/>
+                <w:szCs w:val="19"/>
+              </w:rPr>
+              <w:t xml:space="preserve"> (13 digits, read by every scanner; the default), </w:t>
+            </w:r>
+            <w:r>
+              <w:rPr>
+                <w:b/>
+                <w:bCs/>
+                <w:sz w:val="19"/>
+                <w:szCs w:val="19"/>
+              </w:rPr>
+              <w:t xml:space="preserve">EAN-8</w:t>
+            </w:r>
+            <w:r>
+              <w:rPr>
+                <w:sz w:val="19"/>
+                <w:szCs w:val="19"/>
+              </w:rPr>
+              <w:t xml:space="preserve"> (8 digits, for small items), </w:t>
+            </w:r>
+            <w:r>
+              <w:rPr>
+                <w:b/>
+                <w:bCs/>
+                <w:sz w:val="19"/>
+                <w:szCs w:val="19"/>
+              </w:rPr>
+              <w:t xml:space="preserve">UPC-A</w:t>
+            </w:r>
+            <w:r>
+              <w:rPr>
+                <w:sz w:val="19"/>
+                <w:szCs w:val="19"/>
+              </w:rPr>
+              <w:t xml:space="preserve"> (12 digits), or </w:t>
+            </w:r>
+            <w:r>
+              <w:rPr>
+                <w:b/>
+                <w:bCs/>
+                <w:sz w:val="19"/>
+                <w:szCs w:val="19"/>
+              </w:rPr>
+              <w:t xml:space="preserve">Code 128, digits only</w:t>
+            </w:r>
+            <w:r>
+              <w:rPr>
+                <w:sz w:val="19"/>
+                <w:szCs w:val="19"/>
+              </w:rPr>
+              <w:t xml:space="preserve"> (any length from 4 to 20 digits).</w:t>
             </w:r>
           </w:p>
         </w:tc>
@@ -542,53 +618,69 @@
       <w:tr>
         <w:tc>
           <w:tcPr>
-            <w:tcW w:type="dxa" w:w="1621"/>
-            <w:tcBorders>
-              <w:top w:val="single" w:color="D1D5DB" w:sz="4"/>
-              <w:left w:val="single" w:color="D1D5DB" w:sz="4"/>
-              <w:bottom w:val="single" w:color="D1D5DB" w:sz="4"/>
-              <w:right w:val="single" w:color="D1D5DB" w:sz="4"/>
-            </w:tcBorders>
-            <w:tcMar>
-              <w:top w:type="dxa" w:w="60"/>
-              <w:left w:type="dxa" w:w="100"/>
-              <w:bottom w:type="dxa" w:w="60"/>
-              <w:right w:type="dxa" w:w="100"/>
-            </w:tcMar>
-          </w:tcPr>
-          <w:p>
-            <w:r>
-              <w:rPr>
-                <w:sz w:val="19"/>
-                <w:szCs w:val="19"/>
-              </w:rPr>
-              <w:t xml:space="preserve">Item name</w:t>
-            </w:r>
-          </w:p>
-        </w:tc>
-        <w:tc>
-          <w:tcPr>
-            <w:tcW w:type="dxa" w:w="8017"/>
-            <w:tcBorders>
-              <w:top w:val="single" w:color="D1D5DB" w:sz="4"/>
-              <w:left w:val="single" w:color="D1D5DB" w:sz="4"/>
-              <w:bottom w:val="single" w:color="D1D5DB" w:sz="4"/>
-              <w:right w:val="single" w:color="D1D5DB" w:sz="4"/>
-            </w:tcBorders>
-            <w:tcMar>
-              <w:top w:type="dxa" w:w="60"/>
-              <w:left w:type="dxa" w:w="100"/>
-              <w:bottom w:type="dxa" w:w="60"/>
-              <w:right w:type="dxa" w:w="100"/>
-            </w:tcMar>
-          </w:tcPr>
-          <w:p>
-            <w:r>
-              <w:rPr>
-                <w:sz w:val="19"/>
-                <w:szCs w:val="19"/>
-              </w:rPr>
-              <w:t xml:space="preserve">The product's name, on up to two lines.</w:t>
+            <w:tcW w:type="dxa" w:w="1524"/>
+            <w:tcBorders>
+              <w:top w:val="single" w:color="D1D5DB" w:sz="4"/>
+              <w:left w:val="single" w:color="D1D5DB" w:sz="4"/>
+              <w:bottom w:val="single" w:color="D1D5DB" w:sz="4"/>
+              <w:right w:val="single" w:color="D1D5DB" w:sz="4"/>
+            </w:tcBorders>
+            <w:tcMar>
+              <w:top w:type="dxa" w:w="60"/>
+              <w:left w:type="dxa" w:w="100"/>
+              <w:bottom w:type="dxa" w:w="60"/>
+              <w:right w:type="dxa" w:w="100"/>
+            </w:tcMar>
+          </w:tcPr>
+          <w:p>
+            <w:r>
+              <w:rPr>
+                <w:sz w:val="19"/>
+                <w:szCs w:val="19"/>
+              </w:rPr>
+              <w:t xml:space="preserve">Prefix</w:t>
+            </w:r>
+          </w:p>
+        </w:tc>
+        <w:tc>
+          <w:tcPr>
+            <w:tcW w:type="dxa" w:w="8114"/>
+            <w:tcBorders>
+              <w:top w:val="single" w:color="D1D5DB" w:sz="4"/>
+              <w:left w:val="single" w:color="D1D5DB" w:sz="4"/>
+              <w:bottom w:val="single" w:color="D1D5DB" w:sz="4"/>
+              <w:right w:val="single" w:color="D1D5DB" w:sz="4"/>
+            </w:tcBorders>
+            <w:tcMar>
+              <w:top w:type="dxa" w:w="60"/>
+              <w:left w:type="dxa" w:w="100"/>
+              <w:bottom w:type="dxa" w:w="60"/>
+              <w:right w:type="dxa" w:w="100"/>
+            </w:tcMar>
+          </w:tcPr>
+          <w:p>
+            <w:r>
+              <w:rPr>
+                <w:sz w:val="19"/>
+                <w:szCs w:val="19"/>
+              </w:rPr>
+              <w:t xml:space="preserve">The digits every new code starts with, for example </w:t>
+            </w:r>
+            <w:r>
+              <w:rPr>
+                <w:rFonts w:ascii="Consolas" w:cs="Consolas" w:eastAsia="Consolas" w:hAnsi="Consolas"/>
+                <w:sz w:val="19"/>
+                <w:szCs w:val="19"/>
+                <w:shd w:fill="F3F4F6" w:color="auto" w:val="clear"/>
+              </w:rPr>
+              <w:t xml:space="preserve">20</w:t>
+            </w:r>
+            <w:r>
+              <w:rPr>
+                <w:sz w:val="19"/>
+                <w:szCs w:val="19"/>
+              </w:rPr>
+              <w:t xml:space="preserve">.</w:t>
             </w:r>
           </w:p>
         </w:tc>
@@ -596,53 +688,69 @@
       <w:tr>
         <w:tc>
           <w:tcPr>
-            <w:tcW w:type="dxa" w:w="1621"/>
-            <w:tcBorders>
-              <w:top w:val="single" w:color="D1D5DB" w:sz="4"/>
-              <w:left w:val="single" w:color="D1D5DB" w:sz="4"/>
-              <w:bottom w:val="single" w:color="D1D5DB" w:sz="4"/>
-              <w:right w:val="single" w:color="D1D5DB" w:sz="4"/>
-            </w:tcBorders>
-            <w:tcMar>
-              <w:top w:type="dxa" w:w="60"/>
-              <w:left w:type="dxa" w:w="100"/>
-              <w:bottom w:type="dxa" w:w="60"/>
-              <w:right w:type="dxa" w:w="100"/>
-            </w:tcMar>
-          </w:tcPr>
-          <w:p>
-            <w:r>
-              <w:rPr>
-                <w:sz w:val="19"/>
-                <w:szCs w:val="19"/>
-              </w:rPr>
-              <w:t xml:space="preserve">Price</w:t>
-            </w:r>
-          </w:p>
-        </w:tc>
-        <w:tc>
-          <w:tcPr>
-            <w:tcW w:type="dxa" w:w="8017"/>
-            <w:tcBorders>
-              <w:top w:val="single" w:color="D1D5DB" w:sz="4"/>
-              <w:left w:val="single" w:color="D1D5DB" w:sz="4"/>
-              <w:bottom w:val="single" w:color="D1D5DB" w:sz="4"/>
-              <w:right w:val="single" w:color="D1D5DB" w:sz="4"/>
-            </w:tcBorders>
-            <w:tcMar>
-              <w:top w:type="dxa" w:w="60"/>
-              <w:left w:type="dxa" w:w="100"/>
-              <w:bottom w:type="dxa" w:w="60"/>
-              <w:right w:type="dxa" w:w="100"/>
-            </w:tcMar>
-          </w:tcPr>
-          <w:p>
-            <w:r>
-              <w:rPr>
-                <w:sz w:val="19"/>
-                <w:szCs w:val="19"/>
-              </w:rPr>
-              <w:t xml:space="preserve">Today's price at this branch (on the till) or the main price (on the web).</w:t>
+            <w:tcW w:type="dxa" w:w="1524"/>
+            <w:tcBorders>
+              <w:top w:val="single" w:color="D1D5DB" w:sz="4"/>
+              <w:left w:val="single" w:color="D1D5DB" w:sz="4"/>
+              <w:bottom w:val="single" w:color="D1D5DB" w:sz="4"/>
+              <w:right w:val="single" w:color="D1D5DB" w:sz="4"/>
+            </w:tcBorders>
+            <w:tcMar>
+              <w:top w:type="dxa" w:w="60"/>
+              <w:left w:type="dxa" w:w="100"/>
+              <w:bottom w:type="dxa" w:w="60"/>
+              <w:right w:type="dxa" w:w="100"/>
+            </w:tcMar>
+          </w:tcPr>
+          <w:p>
+            <w:r>
+              <w:rPr>
+                <w:sz w:val="19"/>
+                <w:szCs w:val="19"/>
+              </w:rPr>
+              <w:t xml:space="preserve">Start at</w:t>
+            </w:r>
+          </w:p>
+        </w:tc>
+        <w:tc>
+          <w:tcPr>
+            <w:tcW w:type="dxa" w:w="8114"/>
+            <w:tcBorders>
+              <w:top w:val="single" w:color="D1D5DB" w:sz="4"/>
+              <w:left w:val="single" w:color="D1D5DB" w:sz="4"/>
+              <w:bottom w:val="single" w:color="D1D5DB" w:sz="4"/>
+              <w:right w:val="single" w:color="D1D5DB" w:sz="4"/>
+            </w:tcBorders>
+            <w:tcMar>
+              <w:top w:type="dxa" w:w="60"/>
+              <w:left w:type="dxa" w:w="100"/>
+              <w:bottom w:type="dxa" w:w="60"/>
+              <w:right w:type="dxa" w:w="100"/>
+            </w:tcMar>
+          </w:tcPr>
+          <w:p>
+            <w:r>
+              <w:rPr>
+                <w:sz w:val="19"/>
+                <w:szCs w:val="19"/>
+              </w:rPr>
+              <w:t xml:space="preserve">The first item number to use, for example </w:t>
+            </w:r>
+            <w:r>
+              <w:rPr>
+                <w:rFonts w:ascii="Consolas" w:cs="Consolas" w:eastAsia="Consolas" w:hAnsi="Consolas"/>
+                <w:sz w:val="19"/>
+                <w:szCs w:val="19"/>
+                <w:shd w:fill="F3F4F6" w:color="auto" w:val="clear"/>
+              </w:rPr>
+              <w:t xml:space="preserve">1000</w:t>
+            </w:r>
+            <w:r>
+              <w:rPr>
+                <w:sz w:val="19"/>
+                <w:szCs w:val="19"/>
+              </w:rPr>
+              <w:t xml:space="preserve">. The next code always comes after the highest one already used with the same prefix and length, so you never get a duplicate.</w:t>
             </w:r>
           </w:p>
         </w:tc>
@@ -650,53 +758,411 @@
       <w:tr>
         <w:tc>
           <w:tcPr>
-            <w:tcW w:type="dxa" w:w="1621"/>
-            <w:tcBorders>
-              <w:top w:val="single" w:color="D1D5DB" w:sz="4"/>
-              <w:left w:val="single" w:color="D1D5DB" w:sz="4"/>
-              <w:bottom w:val="single" w:color="D1D5DB" w:sz="4"/>
-              <w:right w:val="single" w:color="D1D5DB" w:sz="4"/>
-            </w:tcBorders>
-            <w:tcMar>
-              <w:top w:type="dxa" w:w="60"/>
-              <w:left w:type="dxa" w:w="100"/>
-              <w:bottom w:type="dxa" w:w="60"/>
-              <w:right w:type="dxa" w:w="100"/>
-            </w:tcMar>
-          </w:tcPr>
-          <w:p>
-            <w:r>
-              <w:rPr>
-                <w:sz w:val="19"/>
-                <w:szCs w:val="19"/>
-              </w:rPr>
-              <w:t xml:space="preserve">Barcode / Digits</w:t>
-            </w:r>
-          </w:p>
-        </w:tc>
-        <w:tc>
-          <w:tcPr>
-            <w:tcW w:type="dxa" w:w="8017"/>
-            <w:tcBorders>
-              <w:top w:val="single" w:color="D1D5DB" w:sz="4"/>
-              <w:left w:val="single" w:color="D1D5DB" w:sz="4"/>
-              <w:bottom w:val="single" w:color="D1D5DB" w:sz="4"/>
-              <w:right w:val="single" w:color="D1D5DB" w:sz="4"/>
-            </w:tcBorders>
-            <w:tcMar>
-              <w:top w:type="dxa" w:w="60"/>
-              <w:left w:type="dxa" w:w="100"/>
-              <w:bottom w:type="dxa" w:w="60"/>
-              <w:right w:type="dxa" w:w="100"/>
-            </w:tcMar>
-          </w:tcPr>
-          <w:p>
-            <w:r>
-              <w:rPr>
-                <w:sz w:val="19"/>
-                <w:szCs w:val="19"/>
-              </w:rPr>
-              <w:t xml:space="preserve">The bars and the digits under them.</w:t>
+            <w:tcW w:type="dxa" w:w="1524"/>
+            <w:tcBorders>
+              <w:top w:val="single" w:color="D1D5DB" w:sz="4"/>
+              <w:left w:val="single" w:color="D1D5DB" w:sz="4"/>
+              <w:bottom w:val="single" w:color="D1D5DB" w:sz="4"/>
+              <w:right w:val="single" w:color="D1D5DB" w:sz="4"/>
+            </w:tcBorders>
+            <w:tcMar>
+              <w:top w:type="dxa" w:w="60"/>
+              <w:left w:type="dxa" w:w="100"/>
+              <w:bottom w:type="dxa" w:w="60"/>
+              <w:right w:type="dxa" w:w="100"/>
+            </w:tcMar>
+          </w:tcPr>
+          <w:p>
+            <w:r>
+              <w:rPr>
+                <w:sz w:val="19"/>
+                <w:szCs w:val="19"/>
+              </w:rPr>
+              <w:t xml:space="preserve">Digits</w:t>
+            </w:r>
+          </w:p>
+        </w:tc>
+        <w:tc>
+          <w:tcPr>
+            <w:tcW w:type="dxa" w:w="8114"/>
+            <w:tcBorders>
+              <w:top w:val="single" w:color="D1D5DB" w:sz="4"/>
+              <w:left w:val="single" w:color="D1D5DB" w:sz="4"/>
+              <w:bottom w:val="single" w:color="D1D5DB" w:sz="4"/>
+              <w:right w:val="single" w:color="D1D5DB" w:sz="4"/>
+            </w:tcBorders>
+            <w:tcMar>
+              <w:top w:type="dxa" w:w="60"/>
+              <w:left w:type="dxa" w:w="100"/>
+              <w:bottom w:type="dxa" w:w="60"/>
+              <w:right w:type="dxa" w:w="100"/>
+            </w:tcMar>
+          </w:tcPr>
+          <w:p>
+            <w:r>
+              <w:rPr>
+                <w:sz w:val="19"/>
+                <w:szCs w:val="19"/>
+              </w:rPr>
+              <w:t xml:space="preserve">Fixed for EAN-13 (13), EAN-8 (8) and UPC-A (12). For Code 128 you choose the length, and you can add a check digit.</w:t>
+            </w:r>
+          </w:p>
+        </w:tc>
+      </w:tr>
+    </w:tbl>
+    <w:p>
+      <w:pPr>
+        <w:spacing w:after="80"/>
+      </w:pPr>
+    </w:p>
+    <w:p>
+      <w:pPr>
+        <w:spacing w:after="120"/>
+      </w:pPr>
+      <w:r>
+        <w:rPr>
+          <w:b/>
+          <w:bCs/>
+        </w:rPr>
+        <w:t xml:space="preserve">What the digits are made of.</w:t>
+      </w:r>
+      <w:r>
+        <w:t xml:space="preserve"> A code is the prefix, then the item number (filled with zeros), then a </w:t>
+      </w:r>
+      <w:r>
+        <w:rPr>
+          <w:b/>
+          <w:bCs/>
+        </w:rPr>
+        <w:t xml:space="preserve">check digit</w:t>
+      </w:r>
+      <w:r>
+        <w:t xml:space="preserve"> worked out from the other digits. The scanner uses the check digit to catch a misread. For example, EAN-13 with prefix 20: </w:t>
+      </w:r>
+      <w:r>
+        <w:rPr>
+          <w:rFonts w:ascii="Consolas" w:cs="Consolas" w:eastAsia="Consolas" w:hAnsi="Consolas"/>
+          <w:sz w:val="19"/>
+          <w:szCs w:val="19"/>
+          <w:shd w:fill="F3F4F6" w:color="auto" w:val="clear"/>
+        </w:rPr>
+        <w:t xml:space="preserve">20</w:t>
+      </w:r>
+      <w:r>
+        <w:t xml:space="preserve"> + </w:t>
+      </w:r>
+      <w:r>
+        <w:rPr>
+          <w:rFonts w:ascii="Consolas" w:cs="Consolas" w:eastAsia="Consolas" w:hAnsi="Consolas"/>
+          <w:sz w:val="19"/>
+          <w:szCs w:val="19"/>
+          <w:shd w:fill="F3F4F6" w:color="auto" w:val="clear"/>
+        </w:rPr>
+        <w:t xml:space="preserve">0000000001</w:t>
+      </w:r>
+      <w:r>
+        <w:t xml:space="preserve"> + </w:t>
+      </w:r>
+      <w:r>
+        <w:rPr>
+          <w:rFonts w:ascii="Consolas" w:cs="Consolas" w:eastAsia="Consolas" w:hAnsi="Consolas"/>
+          <w:sz w:val="19"/>
+          <w:szCs w:val="19"/>
+          <w:shd w:fill="F3F4F6" w:color="auto" w:val="clear"/>
+        </w:rPr>
+        <w:t xml:space="preserve">5</w:t>
+      </w:r>
+      <w:r>
+        <w:t xml:space="preserve"> = </w:t>
+      </w:r>
+      <w:r>
+        <w:rPr>
+          <w:rFonts w:ascii="Consolas" w:cs="Consolas" w:eastAsia="Consolas" w:hAnsi="Consolas"/>
+          <w:sz w:val="19"/>
+          <w:szCs w:val="19"/>
+          <w:shd w:fill="F3F4F6" w:color="auto" w:val="clear"/>
+        </w:rPr>
+        <w:t xml:space="preserve">2000000000015</w:t>
+      </w:r>
+      <w:r>
+        <w:t xml:space="preserve">. The screen spells this out ("13 digits: prefix 20 (2) + item number (10) + check digit (1)").</w:t>
+      </w:r>
+    </w:p>
+    <w:p>
+      <w:pPr>
+        <w:spacing w:after="120"/>
+      </w:pPr>
+      <w:r>
+        <w:rPr>
+          <w:b/>
+          <w:bCs/>
+        </w:rPr>
+        <w:t xml:space="preserve">The preview</w:t>
+      </w:r>
+      <w:r>
+        <w:t xml:space="preserve"> under the settings shows the next three codes and how many codes are left in the range.</w:t>
+      </w:r>
+    </w:p>
+    <w:p>
+      <w:pPr>
+        <w:pStyle w:val="ListParagraph"/>
+        <w:numPr>
+          <w:ilvl w:val="0"/>
+          <w:numId w:val="2"/>
+        </w:numPr>
+        <w:spacing w:after="60"/>
+      </w:pPr>
+      <w:r>
+        <w:rPr>
+          <w:b/>
+          <w:bCs/>
+        </w:rPr>
+        <w:t xml:space="preserve">Prefix warnings.</w:t>
+      </w:r>
+      <w:r>
+        <w:t xml:space="preserve"> For EAN-13 and EAN-8, use a prefix that starts with </w:t>
+      </w:r>
+      <w:r>
+        <w:rPr>
+          <w:b/>
+          <w:bCs/>
+        </w:rPr>
+        <w:t xml:space="preserve">20</w:t>
+      </w:r>
+      <w:r>
+        <w:t xml:space="preserve">. For UPC-A, start it with </w:t>
+      </w:r>
+      <w:r>
+        <w:rPr>
+          <w:b/>
+          <w:bCs/>
+        </w:rPr>
+        <w:t xml:space="preserve">4</w:t>
+      </w:r>
+      <w:r>
+        <w:t xml:space="preserve">. Any other prefix could match a manufacturer's barcode, so ZapTill warns you. It still lets you save, in case you have your own reason.</w:t>
+      </w:r>
+    </w:p>
+    <w:p>
+      <w:pPr>
+        <w:pStyle w:val="ListParagraph"/>
+        <w:numPr>
+          <w:ilvl w:val="0"/>
+          <w:numId w:val="2"/>
+        </w:numPr>
+        <w:spacing w:after="60"/>
+      </w:pPr>
+      <w:r>
+        <w:rPr>
+          <w:b/>
+          <w:bCs/>
+        </w:rPr>
+        <w:t xml:space="preserve">Weighing scales.</w:t>
+      </w:r>
+      <w:r>
+        <w:t xml:space="preserve"> EAN-13 codes starting with </w:t>
+      </w:r>
+      <w:r>
+        <w:rPr>
+          <w:b/>
+          <w:bCs/>
+        </w:rPr>
+        <w:t xml:space="preserve">21 to 29</w:t>
+      </w:r>
+      <w:r>
+        <w:t xml:space="preserve">, and UPC-A codes starting with </w:t>
+      </w:r>
+      <w:r>
+        <w:rPr>
+          <w:b/>
+          <w:bCs/>
+        </w:rPr>
+        <w:t xml:space="preserve">2</w:t>
+      </w:r>
+      <w:r>
+        <w:t xml:space="preserve">, are the ones weighing scales print with the weight or price inside. If your prefix would make codes like these, ZapTill warns you: a scale label could be read as one of your items, or one of your codes as a weighed item. Keep </w:t>
+      </w:r>
+      <w:r>
+        <w:rPr>
+          <w:b/>
+          <w:bCs/>
+        </w:rPr>
+        <w:t xml:space="preserve">20</w:t>
+      </w:r>
+      <w:r>
+        <w:t xml:space="preserve"> for EAN-13.</w:t>
+      </w:r>
+    </w:p>
+    <w:p>
+      <w:pPr>
+        <w:pStyle w:val="ListParagraph"/>
+        <w:numPr>
+          <w:ilvl w:val="0"/>
+          <w:numId w:val="2"/>
+        </w:numPr>
+        <w:spacing w:after="60"/>
+      </w:pPr>
+      <w:r>
+        <w:rPr>
+          <w:b/>
+          <w:bCs/>
+        </w:rPr>
+        <w:t xml:space="preserve">When the range is used up</w:t>
+      </w:r>
+      <w:r>
+        <w:t xml:space="preserve">, for example a short Code 128 length with a long prefix, ZapTill generates no codes and says so. It does not give some items a code and skip the rest. Choose a shorter prefix or more digits.</w:t>
+      </w:r>
+    </w:p>
+    <w:p>
+      <w:pPr>
+        <w:pStyle w:val="ListParagraph"/>
+        <w:numPr>
+          <w:ilvl w:val="0"/>
+          <w:numId w:val="2"/>
+        </w:numPr>
+        <w:spacing w:after="60"/>
+      </w:pPr>
+      <w:r>
+        <w:rPr>
+          <w:b/>
+          <w:bCs/>
+        </w:rPr>
+        <w:t xml:space="preserve">Changing the numbering never changes existing barcodes.</w:t>
+      </w:r>
+      <w:r>
+        <w:t xml:space="preserve"> Only codes made from then on follow it.</w:t>
+      </w:r>
+    </w:p>
+    <w:p>
+      <w:pPr>
+        <w:pStyle w:val="Heading1"/>
+        <w:pageBreakBefore/>
+      </w:pPr>
+      <w:r>
+        <w:t xml:space="preserve">2. The label</w:t>
+      </w:r>
+    </w:p>
+    <w:p>
+      <w:pPr>
+        <w:spacing w:after="120"/>
+      </w:pPr>
+      <w:r>
+        <w:t xml:space="preserve">Labels work the same for every kind of business: a shop's shelf labels, a restaurant's or café's grab-and-go and packaged items (bottled drinks, take-away packs), a petrol station's shop items (lubricants, gas, snacks; pump fuel is sold at the pump and is not listed), and anything a car park sells besides parking.</w:t>
+      </w:r>
+    </w:p>
+    <w:p>
+      <w:pPr>
+        <w:spacing w:after="120"/>
+      </w:pPr>
+      <w:r>
+        <w:t xml:space="preserve">On the web the label is set on </w:t>
+      </w:r>
+      <w:r>
+        <w:rPr>
+          <w:b/>
+          <w:bCs/>
+        </w:rPr>
+        <w:t xml:space="preserve">Menu › Print labels</w:t>
+      </w:r>
+      <w:r>
+        <w:t xml:space="preserve">. On the till it is set on </w:t>
+      </w:r>
+      <w:r>
+        <w:rPr>
+          <w:b/>
+          <w:bCs/>
+        </w:rPr>
+        <w:t xml:space="preserve">Manager › Stock › Labels</w:t>
+      </w:r>
+      <w:r>
+        <w:t xml:space="preserve">. Both screens use the same settings. When someone allowed to edit the menu clicks </w:t>
+      </w:r>
+      <w:r>
+        <w:rPr>
+          <w:b/>
+          <w:bCs/>
+        </w:rPr>
+        <w:t xml:space="preserve">Save</w:t>
+      </w:r>
+      <w:r>
+        <w:t xml:space="preserve">, every till and the web use the new settings.</w:t>
+      </w:r>
+    </w:p>
+    <w:tbl>
+      <w:tblPr>
+        <w:tblW w:type="dxa" w:w="9638"/>
+        <w:tblBorders>
+          <w:top w:val="single" w:color="auto" w:sz="4"/>
+          <w:left w:val="single" w:color="auto" w:sz="4"/>
+          <w:bottom w:val="single" w:color="auto" w:sz="4"/>
+          <w:right w:val="single" w:color="auto" w:sz="4"/>
+          <w:insideH w:val="single" w:color="auto" w:sz="4"/>
+          <w:insideV w:val="single" w:color="auto" w:sz="4"/>
+        </w:tblBorders>
+      </w:tblPr>
+      <w:tblGrid>
+        <w:gridCol w:w="1668"/>
+        <w:gridCol w:w="7970"/>
+      </w:tblGrid>
+      <w:tr>
+        <w:trPr>
+          <w:tblHeader/>
+        </w:trPr>
+        <w:tc>
+          <w:tcPr>
+            <w:tcW w:type="dxa" w:w="1668"/>
+            <w:tcBorders>
+              <w:top w:val="single" w:color="D1D5DB" w:sz="4"/>
+              <w:left w:val="single" w:color="D1D5DB" w:sz="4"/>
+              <w:bottom w:val="single" w:color="D1D5DB" w:sz="4"/>
+              <w:right w:val="single" w:color="D1D5DB" w:sz="4"/>
+            </w:tcBorders>
+            <w:shd w:fill="E6F4F1" w:color="auto" w:val="clear"/>
+            <w:tcMar>
+              <w:top w:type="dxa" w:w="60"/>
+              <w:left w:type="dxa" w:w="100"/>
+              <w:bottom w:type="dxa" w:w="60"/>
+              <w:right w:type="dxa" w:w="100"/>
+            </w:tcMar>
+          </w:tcPr>
+          <w:p>
+            <w:r>
+              <w:rPr>
+                <w:b/>
+                <w:bCs/>
+                <w:sz w:val="19"/>
+                <w:szCs w:val="19"/>
+              </w:rPr>
+              <w:t xml:space="preserve">Setting</w:t>
+            </w:r>
+          </w:p>
+        </w:tc>
+        <w:tc>
+          <w:tcPr>
+            <w:tcW w:type="dxa" w:w="7970"/>
+            <w:tcBorders>
+              <w:top w:val="single" w:color="D1D5DB" w:sz="4"/>
+              <w:left w:val="single" w:color="D1D5DB" w:sz="4"/>
+              <w:bottom w:val="single" w:color="D1D5DB" w:sz="4"/>
+              <w:right w:val="single" w:color="D1D5DB" w:sz="4"/>
+            </w:tcBorders>
+            <w:shd w:fill="E6F4F1" w:color="auto" w:val="clear"/>
+            <w:tcMar>
+              <w:top w:type="dxa" w:w="60"/>
+              <w:left w:type="dxa" w:w="100"/>
+              <w:bottom w:type="dxa" w:w="60"/>
+              <w:right w:type="dxa" w:w="100"/>
+            </w:tcMar>
+          </w:tcPr>
+          <w:p>
+            <w:r>
+              <w:rPr>
+                <w:b/>
+                <w:bCs/>
+                <w:sz w:val="19"/>
+                <w:szCs w:val="19"/>
+              </w:rPr>
+              <w:t xml:space="preserve">What it does</w:t>
             </w:r>
           </w:p>
         </w:tc>
@@ -704,53 +1170,53 @@
       <w:tr>
         <w:tc>
           <w:tcPr>
-            <w:tcW w:type="dxa" w:w="1621"/>
-            <w:tcBorders>
-              <w:top w:val="single" w:color="D1D5DB" w:sz="4"/>
-              <w:left w:val="single" w:color="D1D5DB" w:sz="4"/>
-              <w:bottom w:val="single" w:color="D1D5DB" w:sz="4"/>
-              <w:right w:val="single" w:color="D1D5DB" w:sz="4"/>
-            </w:tcBorders>
-            <w:tcMar>
-              <w:top w:type="dxa" w:w="60"/>
-              <w:left w:type="dxa" w:w="100"/>
-              <w:bottom w:type="dxa" w:w="60"/>
-              <w:right w:type="dxa" w:w="100"/>
-            </w:tcMar>
-          </w:tcPr>
-          <w:p>
-            <w:r>
-              <w:rPr>
-                <w:sz w:val="19"/>
-                <w:szCs w:val="19"/>
-              </w:rPr>
-              <w:t xml:space="preserve">Business name</w:t>
-            </w:r>
-          </w:p>
-        </w:tc>
-        <w:tc>
-          <w:tcPr>
-            <w:tcW w:type="dxa" w:w="8017"/>
-            <w:tcBorders>
-              <w:top w:val="single" w:color="D1D5DB" w:sz="4"/>
-              <w:left w:val="single" w:color="D1D5DB" w:sz="4"/>
-              <w:bottom w:val="single" w:color="D1D5DB" w:sz="4"/>
-              <w:right w:val="single" w:color="D1D5DB" w:sz="4"/>
-            </w:tcBorders>
-            <w:tcMar>
-              <w:top w:type="dxa" w:w="60"/>
-              <w:left w:type="dxa" w:w="100"/>
-              <w:bottom w:type="dxa" w:w="60"/>
-              <w:right w:type="dxa" w:w="100"/>
-            </w:tcMar>
-          </w:tcPr>
-          <w:p>
-            <w:r>
-              <w:rPr>
-                <w:sz w:val="19"/>
-                <w:szCs w:val="19"/>
-              </w:rPr>
-              <w:t xml:space="preserve">Your business's name at the top. On a small label it is the first thing left off.</w:t>
+            <w:tcW w:type="dxa" w:w="1668"/>
+            <w:tcBorders>
+              <w:top w:val="single" w:color="D1D5DB" w:sz="4"/>
+              <w:left w:val="single" w:color="D1D5DB" w:sz="4"/>
+              <w:bottom w:val="single" w:color="D1D5DB" w:sz="4"/>
+              <w:right w:val="single" w:color="D1D5DB" w:sz="4"/>
+            </w:tcBorders>
+            <w:tcMar>
+              <w:top w:type="dxa" w:w="60"/>
+              <w:left w:type="dxa" w:w="100"/>
+              <w:bottom w:type="dxa" w:w="60"/>
+              <w:right w:type="dxa" w:w="100"/>
+            </w:tcMar>
+          </w:tcPr>
+          <w:p>
+            <w:r>
+              <w:rPr>
+                <w:sz w:val="19"/>
+                <w:szCs w:val="19"/>
+              </w:rPr>
+              <w:t xml:space="preserve">Size</w:t>
+            </w:r>
+          </w:p>
+        </w:tc>
+        <w:tc>
+          <w:tcPr>
+            <w:tcW w:type="dxa" w:w="7970"/>
+            <w:tcBorders>
+              <w:top w:val="single" w:color="D1D5DB" w:sz="4"/>
+              <w:left w:val="single" w:color="D1D5DB" w:sz="4"/>
+              <w:bottom w:val="single" w:color="D1D5DB" w:sz="4"/>
+              <w:right w:val="single" w:color="D1D5DB" w:sz="4"/>
+            </w:tcBorders>
+            <w:tcMar>
+              <w:top w:type="dxa" w:w="60"/>
+              <w:left w:type="dxa" w:w="100"/>
+              <w:bottom w:type="dxa" w:w="60"/>
+              <w:right w:type="dxa" w:w="100"/>
+            </w:tcMar>
+          </w:tcPr>
+          <w:p>
+            <w:r>
+              <w:rPr>
+                <w:sz w:val="19"/>
+                <w:szCs w:val="19"/>
+              </w:rPr>
+              <w:t xml:space="preserve">30×20, 38×25, 40×30, 50×25, 50×30, 58×40 or 60×40 mm, or type any width × height. Measure one label on the roll, without the gap.</w:t>
             </w:r>
           </w:p>
         </w:tc>
@@ -758,53 +1224,53 @@
       <w:tr>
         <w:tc>
           <w:tcPr>
-            <w:tcW w:type="dxa" w:w="1621"/>
-            <w:tcBorders>
-              <w:top w:val="single" w:color="D1D5DB" w:sz="4"/>
-              <w:left w:val="single" w:color="D1D5DB" w:sz="4"/>
-              <w:bottom w:val="single" w:color="D1D5DB" w:sz="4"/>
-              <w:right w:val="single" w:color="D1D5DB" w:sz="4"/>
-            </w:tcBorders>
-            <w:tcMar>
-              <w:top w:type="dxa" w:w="60"/>
-              <w:left w:type="dxa" w:w="100"/>
-              <w:bottom w:type="dxa" w:w="60"/>
-              <w:right w:type="dxa" w:w="100"/>
-            </w:tcMar>
-          </w:tcPr>
-          <w:p>
-            <w:r>
-              <w:rPr>
-                <w:sz w:val="19"/>
-                <w:szCs w:val="19"/>
-              </w:rPr>
-              <w:t xml:space="preserve">After the price</w:t>
-            </w:r>
-          </w:p>
-        </w:tc>
-        <w:tc>
-          <w:tcPr>
-            <w:tcW w:type="dxa" w:w="8017"/>
-            <w:tcBorders>
-              <w:top w:val="single" w:color="D1D5DB" w:sz="4"/>
-              <w:left w:val="single" w:color="D1D5DB" w:sz="4"/>
-              <w:bottom w:val="single" w:color="D1D5DB" w:sz="4"/>
-              <w:right w:val="single" w:color="D1D5DB" w:sz="4"/>
-            </w:tcBorders>
-            <w:tcMar>
-              <w:top w:type="dxa" w:w="60"/>
-              <w:left w:type="dxa" w:w="100"/>
-              <w:bottom w:type="dxa" w:w="60"/>
-              <w:right w:type="dxa" w:w="100"/>
-            </w:tcMar>
-          </w:tcPr>
-          <w:p>
-            <w:r>
-              <w:rPr>
-                <w:sz w:val="19"/>
-                <w:szCs w:val="19"/>
-              </w:rPr>
-              <w:t xml:space="preserve">Optional text, for example "per kg".</w:t>
+            <w:tcW w:type="dxa" w:w="1668"/>
+            <w:tcBorders>
+              <w:top w:val="single" w:color="D1D5DB" w:sz="4"/>
+              <w:left w:val="single" w:color="D1D5DB" w:sz="4"/>
+              <w:bottom w:val="single" w:color="D1D5DB" w:sz="4"/>
+              <w:right w:val="single" w:color="D1D5DB" w:sz="4"/>
+            </w:tcBorders>
+            <w:tcMar>
+              <w:top w:type="dxa" w:w="60"/>
+              <w:left w:type="dxa" w:w="100"/>
+              <w:bottom w:type="dxa" w:w="60"/>
+              <w:right w:type="dxa" w:w="100"/>
+            </w:tcMar>
+          </w:tcPr>
+          <w:p>
+            <w:r>
+              <w:rPr>
+                <w:sz w:val="19"/>
+                <w:szCs w:val="19"/>
+              </w:rPr>
+              <w:t xml:space="preserve">Item name</w:t>
+            </w:r>
+          </w:p>
+        </w:tc>
+        <w:tc>
+          <w:tcPr>
+            <w:tcW w:type="dxa" w:w="7970"/>
+            <w:tcBorders>
+              <w:top w:val="single" w:color="D1D5DB" w:sz="4"/>
+              <w:left w:val="single" w:color="D1D5DB" w:sz="4"/>
+              <w:bottom w:val="single" w:color="D1D5DB" w:sz="4"/>
+              <w:right w:val="single" w:color="D1D5DB" w:sz="4"/>
+            </w:tcBorders>
+            <w:tcMar>
+              <w:top w:type="dxa" w:w="60"/>
+              <w:left w:type="dxa" w:w="100"/>
+              <w:bottom w:type="dxa" w:w="60"/>
+              <w:right w:type="dxa" w:w="100"/>
+            </w:tcMar>
+          </w:tcPr>
+          <w:p>
+            <w:r>
+              <w:rPr>
+                <w:sz w:val="19"/>
+                <w:szCs w:val="19"/>
+              </w:rPr>
+              <w:t xml:space="preserve">The product's name, on up to two lines.</w:t>
             </w:r>
           </w:p>
         </w:tc>
@@ -812,53 +1278,53 @@
       <w:tr>
         <w:tc>
           <w:tcPr>
-            <w:tcW w:type="dxa" w:w="1621"/>
-            <w:tcBorders>
-              <w:top w:val="single" w:color="D1D5DB" w:sz="4"/>
-              <w:left w:val="single" w:color="D1D5DB" w:sz="4"/>
-              <w:bottom w:val="single" w:color="D1D5DB" w:sz="4"/>
-              <w:right w:val="single" w:color="D1D5DB" w:sz="4"/>
-            </w:tcBorders>
-            <w:tcMar>
-              <w:top w:type="dxa" w:w="60"/>
-              <w:left w:type="dxa" w:w="100"/>
-              <w:bottom w:type="dxa" w:w="60"/>
-              <w:right w:type="dxa" w:w="100"/>
-            </w:tcMar>
-          </w:tcPr>
-          <w:p>
-            <w:r>
-              <w:rPr>
-                <w:sz w:val="19"/>
-                <w:szCs w:val="19"/>
-              </w:rPr>
-              <w:t xml:space="preserve">Printer dpi</w:t>
-            </w:r>
-          </w:p>
-        </w:tc>
-        <w:tc>
-          <w:tcPr>
-            <w:tcW w:type="dxa" w:w="8017"/>
-            <w:tcBorders>
-              <w:top w:val="single" w:color="D1D5DB" w:sz="4"/>
-              <w:left w:val="single" w:color="D1D5DB" w:sz="4"/>
-              <w:bottom w:val="single" w:color="D1D5DB" w:sz="4"/>
-              <w:right w:val="single" w:color="D1D5DB" w:sz="4"/>
-            </w:tcBorders>
-            <w:tcMar>
-              <w:top w:type="dxa" w:w="60"/>
-              <w:left w:type="dxa" w:w="100"/>
-              <w:bottom w:type="dxa" w:w="60"/>
-              <w:right w:type="dxa" w:w="100"/>
-            </w:tcMar>
-          </w:tcPr>
-          <w:p>
-            <w:r>
-              <w:rPr>
-                <w:sz w:val="19"/>
-                <w:szCs w:val="19"/>
-              </w:rPr>
-              <w:t xml:space="preserve">203 dpi (most label printers) or 300 dpi. Check the printer's box or its test page.</w:t>
+            <w:tcW w:type="dxa" w:w="1668"/>
+            <w:tcBorders>
+              <w:top w:val="single" w:color="D1D5DB" w:sz="4"/>
+              <w:left w:val="single" w:color="D1D5DB" w:sz="4"/>
+              <w:bottom w:val="single" w:color="D1D5DB" w:sz="4"/>
+              <w:right w:val="single" w:color="D1D5DB" w:sz="4"/>
+            </w:tcBorders>
+            <w:tcMar>
+              <w:top w:type="dxa" w:w="60"/>
+              <w:left w:type="dxa" w:w="100"/>
+              <w:bottom w:type="dxa" w:w="60"/>
+              <w:right w:type="dxa" w:w="100"/>
+            </w:tcMar>
+          </w:tcPr>
+          <w:p>
+            <w:r>
+              <w:rPr>
+                <w:sz w:val="19"/>
+                <w:szCs w:val="19"/>
+              </w:rPr>
+              <w:t xml:space="preserve">Price</w:t>
+            </w:r>
+          </w:p>
+        </w:tc>
+        <w:tc>
+          <w:tcPr>
+            <w:tcW w:type="dxa" w:w="7970"/>
+            <w:tcBorders>
+              <w:top w:val="single" w:color="D1D5DB" w:sz="4"/>
+              <w:left w:val="single" w:color="D1D5DB" w:sz="4"/>
+              <w:bottom w:val="single" w:color="D1D5DB" w:sz="4"/>
+              <w:right w:val="single" w:color="D1D5DB" w:sz="4"/>
+            </w:tcBorders>
+            <w:tcMar>
+              <w:top w:type="dxa" w:w="60"/>
+              <w:left w:type="dxa" w:w="100"/>
+              <w:bottom w:type="dxa" w:w="60"/>
+              <w:right w:type="dxa" w:w="100"/>
+            </w:tcMar>
+          </w:tcPr>
+          <w:p>
+            <w:r>
+              <w:rPr>
+                <w:sz w:val="19"/>
+                <w:szCs w:val="19"/>
+              </w:rPr>
+              <w:t xml:space="preserve">Today's price at this branch (on the till) or the main price (on the web).</w:t>
             </w:r>
           </w:p>
         </w:tc>
@@ -866,7 +1332,277 @@
       <w:tr>
         <w:tc>
           <w:tcPr>
-            <w:tcW w:type="dxa" w:w="1621"/>
+            <w:tcW w:type="dxa" w:w="1668"/>
+            <w:tcBorders>
+              <w:top w:val="single" w:color="D1D5DB" w:sz="4"/>
+              <w:left w:val="single" w:color="D1D5DB" w:sz="4"/>
+              <w:bottom w:val="single" w:color="D1D5DB" w:sz="4"/>
+              <w:right w:val="single" w:color="D1D5DB" w:sz="4"/>
+            </w:tcBorders>
+            <w:tcMar>
+              <w:top w:type="dxa" w:w="60"/>
+              <w:left w:type="dxa" w:w="100"/>
+              <w:bottom w:type="dxa" w:w="60"/>
+              <w:right w:type="dxa" w:w="100"/>
+            </w:tcMar>
+          </w:tcPr>
+          <w:p>
+            <w:r>
+              <w:rPr>
+                <w:sz w:val="19"/>
+                <w:szCs w:val="19"/>
+              </w:rPr>
+              <w:t xml:space="preserve">Barcode</w:t>
+            </w:r>
+          </w:p>
+        </w:tc>
+        <w:tc>
+          <w:tcPr>
+            <w:tcW w:type="dxa" w:w="7970"/>
+            <w:tcBorders>
+              <w:top w:val="single" w:color="D1D5DB" w:sz="4"/>
+              <w:left w:val="single" w:color="D1D5DB" w:sz="4"/>
+              <w:bottom w:val="single" w:color="D1D5DB" w:sz="4"/>
+              <w:right w:val="single" w:color="D1D5DB" w:sz="4"/>
+            </w:tcBorders>
+            <w:tcMar>
+              <w:top w:type="dxa" w:w="60"/>
+              <w:left w:type="dxa" w:w="100"/>
+              <w:bottom w:type="dxa" w:w="60"/>
+              <w:right w:type="dxa" w:w="100"/>
+            </w:tcMar>
+          </w:tcPr>
+          <w:p>
+            <w:r>
+              <w:rPr>
+                <w:sz w:val="19"/>
+                <w:szCs w:val="19"/>
+              </w:rPr>
+              <w:t xml:space="preserve">Always printed. There is no setting to turn it off.</w:t>
+            </w:r>
+          </w:p>
+        </w:tc>
+      </w:tr>
+      <w:tr>
+        <w:tc>
+          <w:tcPr>
+            <w:tcW w:type="dxa" w:w="1668"/>
+            <w:tcBorders>
+              <w:top w:val="single" w:color="D1D5DB" w:sz="4"/>
+              <w:left w:val="single" w:color="D1D5DB" w:sz="4"/>
+              <w:bottom w:val="single" w:color="D1D5DB" w:sz="4"/>
+              <w:right w:val="single" w:color="D1D5DB" w:sz="4"/>
+            </w:tcBorders>
+            <w:tcMar>
+              <w:top w:type="dxa" w:w="60"/>
+              <w:left w:type="dxa" w:w="100"/>
+              <w:bottom w:type="dxa" w:w="60"/>
+              <w:right w:type="dxa" w:w="100"/>
+            </w:tcMar>
+          </w:tcPr>
+          <w:p>
+            <w:r>
+              <w:rPr>
+                <w:sz w:val="19"/>
+                <w:szCs w:val="19"/>
+              </w:rPr>
+              <w:t xml:space="preserve">Digits under the bars</w:t>
+            </w:r>
+          </w:p>
+        </w:tc>
+        <w:tc>
+          <w:tcPr>
+            <w:tcW w:type="dxa" w:w="7970"/>
+            <w:tcBorders>
+              <w:top w:val="single" w:color="D1D5DB" w:sz="4"/>
+              <w:left w:val="single" w:color="D1D5DB" w:sz="4"/>
+              <w:bottom w:val="single" w:color="D1D5DB" w:sz="4"/>
+              <w:right w:val="single" w:color="D1D5DB" w:sz="4"/>
+            </w:tcBorders>
+            <w:tcMar>
+              <w:top w:type="dxa" w:w="60"/>
+              <w:left w:type="dxa" w:w="100"/>
+              <w:bottom w:type="dxa" w:w="60"/>
+              <w:right w:type="dxa" w:w="100"/>
+            </w:tcMar>
+          </w:tcPr>
+          <w:p>
+            <w:r>
+              <w:rPr>
+                <w:sz w:val="19"/>
+                <w:szCs w:val="19"/>
+              </w:rPr>
+              <w:t xml:space="preserve">The barcode's digits printed under the bars. On by default; turn it off for a cleaner label.</w:t>
+            </w:r>
+          </w:p>
+        </w:tc>
+      </w:tr>
+      <w:tr>
+        <w:tc>
+          <w:tcPr>
+            <w:tcW w:type="dxa" w:w="1668"/>
+            <w:tcBorders>
+              <w:top w:val="single" w:color="D1D5DB" w:sz="4"/>
+              <w:left w:val="single" w:color="D1D5DB" w:sz="4"/>
+              <w:bottom w:val="single" w:color="D1D5DB" w:sz="4"/>
+              <w:right w:val="single" w:color="D1D5DB" w:sz="4"/>
+            </w:tcBorders>
+            <w:tcMar>
+              <w:top w:type="dxa" w:w="60"/>
+              <w:left w:type="dxa" w:w="100"/>
+              <w:bottom w:type="dxa" w:w="60"/>
+              <w:right w:type="dxa" w:w="100"/>
+            </w:tcMar>
+          </w:tcPr>
+          <w:p>
+            <w:r>
+              <w:rPr>
+                <w:sz w:val="19"/>
+                <w:szCs w:val="19"/>
+              </w:rPr>
+              <w:t xml:space="preserve">Business name</w:t>
+            </w:r>
+          </w:p>
+        </w:tc>
+        <w:tc>
+          <w:tcPr>
+            <w:tcW w:type="dxa" w:w="7970"/>
+            <w:tcBorders>
+              <w:top w:val="single" w:color="D1D5DB" w:sz="4"/>
+              <w:left w:val="single" w:color="D1D5DB" w:sz="4"/>
+              <w:bottom w:val="single" w:color="D1D5DB" w:sz="4"/>
+              <w:right w:val="single" w:color="D1D5DB" w:sz="4"/>
+            </w:tcBorders>
+            <w:tcMar>
+              <w:top w:type="dxa" w:w="60"/>
+              <w:left w:type="dxa" w:w="100"/>
+              <w:bottom w:type="dxa" w:w="60"/>
+              <w:right w:type="dxa" w:w="100"/>
+            </w:tcMar>
+          </w:tcPr>
+          <w:p>
+            <w:r>
+              <w:rPr>
+                <w:sz w:val="19"/>
+                <w:szCs w:val="19"/>
+              </w:rPr>
+              <w:t xml:space="preserve">Your business's name at the top. On a small label it is the first thing left off.</w:t>
+            </w:r>
+          </w:p>
+        </w:tc>
+      </w:tr>
+      <w:tr>
+        <w:tc>
+          <w:tcPr>
+            <w:tcW w:type="dxa" w:w="1668"/>
+            <w:tcBorders>
+              <w:top w:val="single" w:color="D1D5DB" w:sz="4"/>
+              <w:left w:val="single" w:color="D1D5DB" w:sz="4"/>
+              <w:bottom w:val="single" w:color="D1D5DB" w:sz="4"/>
+              <w:right w:val="single" w:color="D1D5DB" w:sz="4"/>
+            </w:tcBorders>
+            <w:tcMar>
+              <w:top w:type="dxa" w:w="60"/>
+              <w:left w:type="dxa" w:w="100"/>
+              <w:bottom w:type="dxa" w:w="60"/>
+              <w:right w:type="dxa" w:w="100"/>
+            </w:tcMar>
+          </w:tcPr>
+          <w:p>
+            <w:r>
+              <w:rPr>
+                <w:sz w:val="19"/>
+                <w:szCs w:val="19"/>
+              </w:rPr>
+              <w:t xml:space="preserve">After the price</w:t>
+            </w:r>
+          </w:p>
+        </w:tc>
+        <w:tc>
+          <w:tcPr>
+            <w:tcW w:type="dxa" w:w="7970"/>
+            <w:tcBorders>
+              <w:top w:val="single" w:color="D1D5DB" w:sz="4"/>
+              <w:left w:val="single" w:color="D1D5DB" w:sz="4"/>
+              <w:bottom w:val="single" w:color="D1D5DB" w:sz="4"/>
+              <w:right w:val="single" w:color="D1D5DB" w:sz="4"/>
+            </w:tcBorders>
+            <w:tcMar>
+              <w:top w:type="dxa" w:w="60"/>
+              <w:left w:type="dxa" w:w="100"/>
+              <w:bottom w:type="dxa" w:w="60"/>
+              <w:right w:type="dxa" w:w="100"/>
+            </w:tcMar>
+          </w:tcPr>
+          <w:p>
+            <w:r>
+              <w:rPr>
+                <w:sz w:val="19"/>
+                <w:szCs w:val="19"/>
+              </w:rPr>
+              <w:t xml:space="preserve">Optional text, for example "per kg".</w:t>
+            </w:r>
+          </w:p>
+        </w:tc>
+      </w:tr>
+      <w:tr>
+        <w:tc>
+          <w:tcPr>
+            <w:tcW w:type="dxa" w:w="1668"/>
+            <w:tcBorders>
+              <w:top w:val="single" w:color="D1D5DB" w:sz="4"/>
+              <w:left w:val="single" w:color="D1D5DB" w:sz="4"/>
+              <w:bottom w:val="single" w:color="D1D5DB" w:sz="4"/>
+              <w:right w:val="single" w:color="D1D5DB" w:sz="4"/>
+            </w:tcBorders>
+            <w:tcMar>
+              <w:top w:type="dxa" w:w="60"/>
+              <w:left w:type="dxa" w:w="100"/>
+              <w:bottom w:type="dxa" w:w="60"/>
+              <w:right w:type="dxa" w:w="100"/>
+            </w:tcMar>
+          </w:tcPr>
+          <w:p>
+            <w:r>
+              <w:rPr>
+                <w:sz w:val="19"/>
+                <w:szCs w:val="19"/>
+              </w:rPr>
+              <w:t xml:space="preserve">Printer dpi</w:t>
+            </w:r>
+          </w:p>
+        </w:tc>
+        <w:tc>
+          <w:tcPr>
+            <w:tcW w:type="dxa" w:w="7970"/>
+            <w:tcBorders>
+              <w:top w:val="single" w:color="D1D5DB" w:sz="4"/>
+              <w:left w:val="single" w:color="D1D5DB" w:sz="4"/>
+              <w:bottom w:val="single" w:color="D1D5DB" w:sz="4"/>
+              <w:right w:val="single" w:color="D1D5DB" w:sz="4"/>
+            </w:tcBorders>
+            <w:tcMar>
+              <w:top w:type="dxa" w:w="60"/>
+              <w:left w:type="dxa" w:w="100"/>
+              <w:bottom w:type="dxa" w:w="60"/>
+              <w:right w:type="dxa" w:w="100"/>
+            </w:tcMar>
+          </w:tcPr>
+          <w:p>
+            <w:r>
+              <w:rPr>
+                <w:sz w:val="19"/>
+                <w:szCs w:val="19"/>
+              </w:rPr>
+              <w:t xml:space="preserve">203 dpi (most label printers) or 300 dpi. Check the printer's box or its test page.</w:t>
+            </w:r>
+          </w:p>
+        </w:tc>
+      </w:tr>
+      <w:tr>
+        <w:tc>
+          <w:tcPr>
+            <w:tcW w:type="dxa" w:w="1668"/>
             <w:tcBorders>
               <w:top w:val="single" w:color="D1D5DB" w:sz="4"/>
               <w:left w:val="single" w:color="D1D5DB" w:sz="4"/>
@@ -892,7 +1628,7 @@
         </w:tc>
         <w:tc>
           <w:tcPr>
-            <w:tcW w:type="dxa" w:w="8017"/>
+            <w:tcW w:type="dxa" w:w="7970"/>
             <w:tcBorders>
               <w:top w:val="single" w:color="D1D5DB" w:sz="4"/>
               <w:left w:val="single" w:color="D1D5DB" w:sz="4"/>
@@ -990,7 +1726,7 @@
         <w:t xml:space="preserve">Add every generated code</w:t>
       </w:r>
       <w:r>
-        <w:t xml:space="preserve"> adds every product that has a ZapTill code (starting with 20).</w:t>
+        <w:t xml:space="preserve"> adds every product that has a code ZapTill generated (by your barcode numbering, or starting with 20).</w:t>
       </w:r>
     </w:p>
     <w:p>
@@ -1057,6 +1793,142 @@
       </w:r>
       <w:r>
         <w:t xml:space="preserve">. The ticked products are already chosen.</w:t>
+      </w:r>
+    </w:p>
+    <w:p>
+      <w:pPr>
+        <w:pStyle w:val="Heading2"/>
+      </w:pPr>
+      <w:r>
+        <w:t xml:space="preserve">Items without a barcode</w:t>
+      </w:r>
+    </w:p>
+    <w:p>
+      <w:pPr>
+        <w:spacing w:after="120"/>
+      </w:pPr>
+      <w:r>
+        <w:t xml:space="preserve">A label is never printed without a barcode. If some of the items you chose have none, the screen says so. When you click </w:t>
+      </w:r>
+      <w:r>
+        <w:rPr>
+          <w:b/>
+          <w:bCs/>
+        </w:rPr>
+        <w:t xml:space="preserve">Print</w:t>
+      </w:r>
+      <w:r>
+        <w:t xml:space="preserve">:</w:t>
+      </w:r>
+    </w:p>
+    <w:p>
+      <w:pPr>
+        <w:pStyle w:val="ListParagraph"/>
+        <w:numPr>
+          <w:ilvl w:val="0"/>
+          <w:numId w:val="2"/>
+        </w:numPr>
+        <w:spacing w:after="60"/>
+      </w:pPr>
+      <w:r>
+        <w:rPr>
+          <w:b/>
+          <w:bCs/>
+        </w:rPr>
+        <w:t xml:space="preserve">If you may edit the menu</w:t>
+      </w:r>
+      <w:r>
+        <w:t xml:space="preserve">, ZapTill asks: "3 items have no barcode yet — generate them and print?" Click </w:t>
+      </w:r>
+      <w:r>
+        <w:rPr>
+          <w:b/>
+          <w:bCs/>
+        </w:rPr>
+        <w:t xml:space="preserve">OK</w:t>
+      </w:r>
+      <w:r>
+        <w:t xml:space="preserve">. ZapTill gives those items, and only those items, a barcode using your numbering. Then it prints every label. Click </w:t>
+      </w:r>
+      <w:r>
+        <w:rPr>
+          <w:b/>
+          <w:bCs/>
+        </w:rPr>
+        <w:t xml:space="preserve">Cancel</w:t>
+      </w:r>
+      <w:r>
+        <w:t xml:space="preserve"> to print nothing. The new barcodes are saved to the products, and the tills can scan them after their next menu refresh.</w:t>
+      </w:r>
+    </w:p>
+    <w:p>
+      <w:pPr>
+        <w:pStyle w:val="ListParagraph"/>
+        <w:numPr>
+          <w:ilvl w:val="0"/>
+          <w:numId w:val="2"/>
+        </w:numPr>
+        <w:spacing w:after="60"/>
+      </w:pPr>
+      <w:r>
+        <w:rPr>
+          <w:b/>
+          <w:bCs/>
+        </w:rPr>
+        <w:t xml:space="preserve">If you may not edit the menu</w:t>
+      </w:r>
+      <w:r>
+        <w:t xml:space="preserve">, those items are left out. The other items print, and the screen lists the items left out: "ask a manager to generate barcodes for: Bread, Eggs".</w:t>
+      </w:r>
+    </w:p>
+    <w:p>
+      <w:pPr>
+        <w:pStyle w:val="ListParagraph"/>
+        <w:numPr>
+          <w:ilvl w:val="0"/>
+          <w:numId w:val="2"/>
+        </w:numPr>
+        <w:spacing w:after="60"/>
+      </w:pPr>
+      <w:r>
+        <w:rPr>
+          <w:b/>
+          <w:bCs/>
+        </w:rPr>
+        <w:t xml:space="preserve">On the till without internet</w:t>
+      </w:r>
+      <w:r>
+        <w:t xml:space="preserve">, barcodes cannot be made, because the codes come from the cloud. Those items are left out and named, and the others print. Print them again when the till is back online.</w:t>
+      </w:r>
+    </w:p>
+    <w:p>
+      <w:pPr>
+        <w:pStyle w:val="ListParagraph"/>
+        <w:numPr>
+          <w:ilvl w:val="0"/>
+          <w:numId w:val="2"/>
+        </w:numPr>
+        <w:spacing w:after="60"/>
+      </w:pPr>
+      <w:r>
+        <w:rPr>
+          <w:b/>
+          <w:bCs/>
+        </w:rPr>
+        <w:t xml:space="preserve">A barcode that cannot be printed.</w:t>
+      </w:r>
+      <w:r>
+        <w:t xml:space="preserve"> A code with letters outside A to Z, such as "Café", cannot be drawn. That item is left out and named. Change its barcode on </w:t>
+      </w:r>
+      <w:r>
+        <w:rPr>
+          <w:b/>
+          <w:bCs/>
+        </w:rPr>
+        <w:t xml:space="preserve">Menu › Products</w:t>
+      </w:r>
+      <w:r>
+        <w:t xml:space="preserve">. Any other code you typed prints, as Code 128 if it is not a valid EAN or UPC.</w:t>
       </w:r>
     </w:p>
     <w:p>
@@ -2423,7 +3295,7 @@
                 <w:sz w:val="19"/>
                 <w:szCs w:val="19"/>
               </w:rPr>
-              <w:t xml:space="preserve">"No barcode" next to an item</w:t>
+              <w:t xml:space="preserve">"No barcode yet" next to an item</w:t>
             </w:r>
           </w:p>
         </w:tc>
@@ -2449,7 +3321,7 @@
                 <w:sz w:val="19"/>
                 <w:szCs w:val="19"/>
               </w:rPr>
-              <w:t xml:space="preserve">Give it one: </w:t>
+              <w:t xml:space="preserve">Nothing to do if you may edit the menu: it gets a barcode when you print. Otherwise ask a manager, or use </w:t>
             </w:r>
             <w:r>
               <w:rPr>
@@ -2493,7 +3365,7 @@
                 <w:sz w:val="19"/>
                 <w:szCs w:val="19"/>
               </w:rPr>
-              <w:t xml:space="preserve">The till says the label printer did not answer</w:t>
+              <w:t xml:space="preserve">"Not printed: ask a manager to generate barcodes for: …"</w:t>
             </w:r>
           </w:p>
         </w:tc>
@@ -2519,7 +3391,7 @@
                 <w:sz w:val="19"/>
                 <w:szCs w:val="19"/>
               </w:rPr>
-              <w:t xml:space="preserve">Check the IP address (print the printer's self-test page to see it), that the printer is on the same network, and that it is switched on.</w:t>
+              <w:t xml:space="preserve">You may not create barcodes. Someone who may edit the menu prints those items, or generates their barcodes first.</w:t>
             </w:r>
           </w:p>
         </w:tc>
@@ -2547,6 +3419,130 @@
                 <w:sz w:val="19"/>
                 <w:szCs w:val="19"/>
               </w:rPr>
+              <w:t xml:space="preserve">"The barcode numbering range is used up"</w:t>
+            </w:r>
+          </w:p>
+        </w:tc>
+        <w:tc>
+          <w:tcPr>
+            <w:tcW w:type="dxa" w:w="6738"/>
+            <w:tcBorders>
+              <w:top w:val="single" w:color="D1D5DB" w:sz="4"/>
+              <w:left w:val="single" w:color="D1D5DB" w:sz="4"/>
+              <w:bottom w:val="single" w:color="D1D5DB" w:sz="4"/>
+              <w:right w:val="single" w:color="D1D5DB" w:sz="4"/>
+            </w:tcBorders>
+            <w:tcMar>
+              <w:top w:type="dxa" w:w="60"/>
+              <w:left w:type="dxa" w:w="100"/>
+              <w:bottom w:type="dxa" w:w="60"/>
+              <w:right w:type="dxa" w:w="100"/>
+            </w:tcMar>
+          </w:tcPr>
+          <w:p>
+            <w:r>
+              <w:rPr>
+                <w:sz w:val="19"/>
+                <w:szCs w:val="19"/>
+              </w:rPr>
+              <w:t xml:space="preserve">Change </w:t>
+            </w:r>
+            <w:r>
+              <w:rPr>
+                <w:b/>
+                <w:bCs/>
+                <w:sz w:val="19"/>
+                <w:szCs w:val="19"/>
+              </w:rPr>
+              <w:t xml:space="preserve">Barcode numbering</w:t>
+            </w:r>
+            <w:r>
+              <w:rPr>
+                <w:sz w:val="19"/>
+                <w:szCs w:val="19"/>
+              </w:rPr>
+              <w:t xml:space="preserve">: a shorter prefix or more digits.</w:t>
+            </w:r>
+          </w:p>
+        </w:tc>
+      </w:tr>
+      <w:tr>
+        <w:tc>
+          <w:tcPr>
+            <w:tcW w:type="dxa" w:w="2900"/>
+            <w:tcBorders>
+              <w:top w:val="single" w:color="D1D5DB" w:sz="4"/>
+              <w:left w:val="single" w:color="D1D5DB" w:sz="4"/>
+              <w:bottom w:val="single" w:color="D1D5DB" w:sz="4"/>
+              <w:right w:val="single" w:color="D1D5DB" w:sz="4"/>
+            </w:tcBorders>
+            <w:tcMar>
+              <w:top w:type="dxa" w:w="60"/>
+              <w:left w:type="dxa" w:w="100"/>
+              <w:bottom w:type="dxa" w:w="60"/>
+              <w:right w:type="dxa" w:w="100"/>
+            </w:tcMar>
+          </w:tcPr>
+          <w:p>
+            <w:r>
+              <w:rPr>
+                <w:sz w:val="19"/>
+                <w:szCs w:val="19"/>
+              </w:rPr>
+              <w:t xml:space="preserve">The till says the label printer did not answer</w:t>
+            </w:r>
+          </w:p>
+        </w:tc>
+        <w:tc>
+          <w:tcPr>
+            <w:tcW w:type="dxa" w:w="6738"/>
+            <w:tcBorders>
+              <w:top w:val="single" w:color="D1D5DB" w:sz="4"/>
+              <w:left w:val="single" w:color="D1D5DB" w:sz="4"/>
+              <w:bottom w:val="single" w:color="D1D5DB" w:sz="4"/>
+              <w:right w:val="single" w:color="D1D5DB" w:sz="4"/>
+            </w:tcBorders>
+            <w:tcMar>
+              <w:top w:type="dxa" w:w="60"/>
+              <w:left w:type="dxa" w:w="100"/>
+              <w:bottom w:type="dxa" w:w="60"/>
+              <w:right w:type="dxa" w:w="100"/>
+            </w:tcMar>
+          </w:tcPr>
+          <w:p>
+            <w:r>
+              <w:rPr>
+                <w:sz w:val="19"/>
+                <w:szCs w:val="19"/>
+              </w:rPr>
+              <w:t xml:space="preserve">Check the IP address (print the printer's self-test page to see it), that the printer is on the same network, and that it is switched on.</w:t>
+            </w:r>
+          </w:p>
+        </w:tc>
+      </w:tr>
+      <w:tr>
+        <w:tc>
+          <w:tcPr>
+            <w:tcW w:type="dxa" w:w="2900"/>
+            <w:tcBorders>
+              <w:top w:val="single" w:color="D1D5DB" w:sz="4"/>
+              <w:left w:val="single" w:color="D1D5DB" w:sz="4"/>
+              <w:bottom w:val="single" w:color="D1D5DB" w:sz="4"/>
+              <w:right w:val="single" w:color="D1D5DB" w:sz="4"/>
+            </w:tcBorders>
+            <w:tcMar>
+              <w:top w:type="dxa" w:w="60"/>
+              <w:left w:type="dxa" w:w="100"/>
+              <w:bottom w:type="dxa" w:w="60"/>
+              <w:right w:type="dxa" w:w="100"/>
+            </w:tcMar>
+          </w:tcPr>
+          <w:p>
+            <w:r>
+              <w:rPr>
+                <w:sz w:val="19"/>
+                <w:szCs w:val="19"/>
+              </w:rPr>
               <w:t xml:space="preserve">The price on the shelf is wrong</w:t>
             </w:r>
           </w:p>
@@ -2583,6 +3579,177 @@
       <w:pPr>
         <w:spacing w:after="80"/>
       </w:pPr>
+    </w:p>
+    <w:p>
+      <w:pPr>
+        <w:pStyle w:val="Heading1"/>
+        <w:pageBreakBefore/>
+      </w:pPr>
+      <w:r>
+        <w:t xml:space="preserve">9. Items sold by weight (scale labels)</w:t>
+      </w:r>
+    </w:p>
+    <w:p>
+      <w:pPr>
+        <w:spacing w:after="120"/>
+      </w:pPr>
+      <w:r>
+        <w:t xml:space="preserve">Meat, fruit and vegetables, loose sweets and nyama choma can be sold </w:t>
+      </w:r>
+      <w:r>
+        <w:rPr>
+          <w:b/>
+          <w:bCs/>
+        </w:rPr>
+        <w:t xml:space="preserve">by the kilo</w:t>
+      </w:r>
+      <w:r>
+        <w:t xml:space="preserve">: the weight is the quantity (0.452 kg) and the amount is the price per kg × the weight. The full guide is </w:t>
+      </w:r>
+      <w:r>
+        <w:rPr>
+          <w:b/>
+          <w:bCs/>
+        </w:rPr>
+        <w:t xml:space="preserve">Items sold by weight</w:t>
+      </w:r>
+      <w:r>
+        <w:t xml:space="preserve"> (</w:t>
+      </w:r>
+      <w:r>
+        <w:rPr>
+          <w:rFonts w:ascii="Consolas" w:cs="Consolas" w:eastAsia="Consolas" w:hAnsi="Consolas"/>
+          <w:sz w:val="19"/>
+          <w:szCs w:val="19"/>
+          <w:shd w:fill="F3F4F6" w:color="auto" w:val="clear"/>
+        </w:rPr>
+        <w:t xml:space="preserve">WEIGHED-ITEMS</w:t>
+      </w:r>
+      <w:r>
+        <w:t xml:space="preserve">); in short:</w:t>
+      </w:r>
+    </w:p>
+    <w:p>
+      <w:pPr>
+        <w:pStyle w:val="ListParagraph"/>
+        <w:numPr>
+          <w:ilvl w:val="0"/>
+          <w:numId w:val="9"/>
+        </w:numPr>
+        <w:spacing w:after="60"/>
+      </w:pPr>
+      <w:r>
+        <w:t xml:space="preserve">On the web, edit the item: price </w:t>
+      </w:r>
+      <w:r>
+        <w:rPr>
+          <w:b/>
+          <w:bCs/>
+        </w:rPr>
+        <w:t xml:space="preserve">per kg</w:t>
+      </w:r>
+      <w:r>
+        <w:t xml:space="preserve">, switch on </w:t>
+      </w:r>
+      <w:r>
+        <w:rPr>
+          <w:b/>
+          <w:bCs/>
+        </w:rPr>
+        <w:t xml:space="preserve">Sold by weight</w:t>
+      </w:r>
+      <w:r>
+        <w:t xml:space="preserve">, and give it its </w:t>
+      </w:r>
+      <w:r>
+        <w:rPr>
+          <w:b/>
+          <w:bCs/>
+        </w:rPr>
+        <w:t xml:space="preserve">Scale code (PLU)</w:t>
+      </w:r>
+      <w:r>
+        <w:t xml:space="preserve"> — the number it has on your weighing scale.</w:t>
+      </w:r>
+    </w:p>
+    <w:p>
+      <w:pPr>
+        <w:pStyle w:val="ListParagraph"/>
+        <w:numPr>
+          <w:ilvl w:val="0"/>
+          <w:numId w:val="9"/>
+        </w:numPr>
+        <w:spacing w:after="60"/>
+      </w:pPr>
+      <w:r>
+        <w:t xml:space="preserve">At any till, tapping the item asks for the weight (a keypad in kg).</w:t>
+      </w:r>
+    </w:p>
+    <w:p>
+      <w:pPr>
+        <w:pStyle w:val="ListParagraph"/>
+        <w:numPr>
+          <w:ilvl w:val="0"/>
+          <w:numId w:val="9"/>
+        </w:numPr>
+        <w:spacing w:after="60"/>
+      </w:pPr>
+      <w:r>
+        <w:t xml:space="preserve">With a </w:t>
+      </w:r>
+      <w:r>
+        <w:rPr>
+          <w:b/>
+          <w:bCs/>
+        </w:rPr>
+        <w:t xml:space="preserve">label scale</w:t>
+      </w:r>
+      <w:r>
+        <w:t xml:space="preserve">, scan the sticker the scale prints: the item is added with its weight and amount. Choose your scale (CAS, DIGI, Ishida or standard) and test one label in </w:t>
+      </w:r>
+      <w:r>
+        <w:rPr>
+          <w:b/>
+          <w:bCs/>
+        </w:rPr>
+        <w:t xml:space="preserve">Settings › Business › Scale labels</w:t>
+      </w:r>
+      <w:r>
+        <w:t xml:space="preserve">.</w:t>
+      </w:r>
+    </w:p>
+    <w:p>
+      <w:pPr>
+        <w:pBdr>
+          <w:left w:val="single" w:color="F59E0B" w:sz="24" w:space="8"/>
+        </w:pBdr>
+        <w:shd w:fill="FFF7E6" w:color="auto" w:val="clear"/>
+        <w:spacing w:before="120" w:after="120"/>
+        <w:ind w:left="200"/>
+      </w:pPr>
+      <w:r>
+        <w:t xml:space="preserve">Scale labels start with </w:t>
+      </w:r>
+      <w:r>
+        <w:rPr>
+          <w:b/>
+          <w:bCs/>
+        </w:rPr>
+        <w:t xml:space="preserve">21–29</w:t>
+      </w:r>
+      <w:r>
+        <w:t xml:space="preserve">. The codes ZapTill generates for your products start with </w:t>
+      </w:r>
+      <w:r>
+        <w:rPr>
+          <w:b/>
+          <w:bCs/>
+        </w:rPr>
+        <w:t xml:space="preserve">20</w:t>
+      </w:r>
+      <w:r>
+        <w:t xml:space="preserve"> and are never read as scale labels, so the two never clash.</w:t>
+      </w:r>
     </w:p>
     <w:sectPr>
       <w:footerReference w:type="default" r:id="rId6"/>
@@ -2854,6 +4021,12 @@
     </w:lvlOverride>
   </w:num>
   <w:num w:numId="8">
+    <w:abstractNumId w:val="3"/>
+    <w:lvlOverride w:ilvl="0">
+      <w:startOverride w:val="1"/>
+    </w:lvlOverride>
+  </w:num>
+  <w:num w:numId="9">
     <w:abstractNumId w:val="3"/>
     <w:lvlOverride w:ilvl="0">
       <w:startOverride w:val="1"/>

</xml_diff>

<commit_message>
Wording: POS / point of sale instead of till across the dashboard, web POS, admin portal, desktop POS, server messages and emails, with a CI check that blocks the word (M-Pesa Till number kept); older POS still understood; technician guide 1.7 and manuals rebuilt (A586)
</commit_message>
<xml_diff>
--- a/docs/Manuals/BARCODE-LABELS.docx
+++ b/docs/Manuals/BARCODE-LABELS.docx
@@ -154,7 +154,7 @@
         <w:t xml:space="preserve">Barcode</w:t>
       </w:r>
       <w:r>
-        <w:t xml:space="preserve"> and scan the item, or type the code. The tills can scan it as soon as they next refresh the menu.</w:t>
+        <w:t xml:space="preserve"> and scan the item, or type the code. The points of sale can scan it as soon as they next refresh the menu.</w:t>
       </w:r>
     </w:p>
     <w:p>
@@ -412,7 +412,7 @@
         <w:t xml:space="preserve">Menu › Print labels</w:t>
       </w:r>
       <w:r>
-        <w:t xml:space="preserve">; on the till it is the same section on </w:t>
+        <w:t xml:space="preserve">; on the POS it is the same section on </w:t>
       </w:r>
       <w:r>
         <w:rPr>
@@ -422,7 +422,7 @@
         <w:t xml:space="preserve">Manager › Stock › Labels</w:t>
       </w:r>
       <w:r>
-        <w:t xml:space="preserve">. Changing it needs the right to edit the menu, and the till needs the internet to save it. Everyone else sees it but cannot change it.</w:t>
+        <w:t xml:space="preserve">. Changing it needs the right to edit the menu, and the POS needs the internet to save it. Everyone else sees it but cannot change it.</w:t>
       </w:r>
     </w:p>
     <w:tbl>
@@ -1065,7 +1065,7 @@
         <w:t xml:space="preserve">Menu › Print labels</w:t>
       </w:r>
       <w:r>
-        <w:t xml:space="preserve">. On the till it is set on </w:t>
+        <w:t xml:space="preserve">. On the POS it is set on </w:t>
       </w:r>
       <w:r>
         <w:rPr>
@@ -1085,7 +1085,7 @@
         <w:t xml:space="preserve">Save</w:t>
       </w:r>
       <w:r>
-        <w:t xml:space="preserve">, every till and the web use the new settings.</w:t>
+        <w:t xml:space="preserve">, every POS and the web use the new settings.</w:t>
       </w:r>
     </w:p>
     <w:tbl>
@@ -1324,7 +1324,7 @@
                 <w:sz w:val="19"/>
                 <w:szCs w:val="19"/>
               </w:rPr>
-              <w:t xml:space="preserve">Today's price at this branch (on the till) or the main price (on the web).</w:t>
+              <w:t xml:space="preserve">Today's price at this branch (on the POS) or the main price (on the web).</w:t>
             </w:r>
           </w:p>
         </w:tc>
@@ -1858,7 +1858,7 @@
         <w:t xml:space="preserve">Cancel</w:t>
       </w:r>
       <w:r>
-        <w:t xml:space="preserve"> to print nothing. The new barcodes are saved to the products, and the tills can scan them after their next menu refresh.</w:t>
+        <w:t xml:space="preserve"> to print nothing. The new barcodes are saved to the products, and the points of sale can scan them after their next menu refresh.</w:t>
       </w:r>
     </w:p>
     <w:p>
@@ -1895,10 +1895,10 @@
           <w:b/>
           <w:bCs/>
         </w:rPr>
-        <w:t xml:space="preserve">On the till without internet</w:t>
-      </w:r>
-      <w:r>
-        <w:t xml:space="preserve">, barcodes cannot be made, because the codes come from the cloud. Those items are left out and named, and the others print. Print them again when the till is back online.</w:t>
+        <w:t xml:space="preserve">On the POS without internet</w:t>
+      </w:r>
+      <w:r>
+        <w:t xml:space="preserve">, barcodes cannot be made, because the codes come from the cloud. Those items are left out and named, and the others print. Print them again when the POS is back online.</w:t>
       </w:r>
     </w:p>
     <w:p>
@@ -2099,7 +2099,7 @@
           <w:b/>
           <w:bCs/>
         </w:rPr>
-        <w:t xml:space="preserve">Till:</w:t>
+        <w:t xml:space="preserve">POS:</w:t>
       </w:r>
       <w:r>
         <w:t xml:space="preserve"> on </w:t>
@@ -2142,7 +2142,7 @@
         <w:t xml:space="preserve">Print</w:t>
       </w:r>
       <w:r>
-        <w:t xml:space="preserve">. The till prints without opening a window.</w:t>
+        <w:t xml:space="preserve">. The POS prints without opening a window.</w:t>
       </w:r>
     </w:p>
     <w:p>
@@ -2371,7 +2371,7 @@
           <w:b/>
           <w:bCs/>
         </w:rPr>
-        <w:t xml:space="preserve">Till only.</w:t>
+        <w:t xml:space="preserve">POS only.</w:t>
       </w:r>
       <w:r>
         <w:t xml:space="preserve"> Under </w:t>
@@ -2489,7 +2489,7 @@
         <w:t xml:space="preserve">Receipt printer</w:t>
       </w:r>
       <w:r>
-        <w:t xml:space="preserve">: prints a barcode slip on the till's receipt roll, for a shelf tag or when the label printer is down. ZapTill uses this till's receipt printer (</w:t>
+        <w:t xml:space="preserve">: prints a barcode slip on the POS's receipt roll, for a shelf tag or when the label printer is down. ZapTill uses this POS's receipt printer (</w:t>
       </w:r>
       <w:r>
         <w:rPr>
@@ -2499,7 +2499,7 @@
         <w:t xml:space="preserve">Settings › Printing</w:t>
       </w:r>
       <w:r>
-        <w:t xml:space="preserve">, Till station) unless you type another address. If the barcode does not print, choose </w:t>
+        <w:t xml:space="preserve">, POS station) unless you type another address. If the barcode does not print, choose </w:t>
       </w:r>
       <w:r>
         <w:rPr>
@@ -3489,7 +3489,7 @@
                 <w:sz w:val="19"/>
                 <w:szCs w:val="19"/>
               </w:rPr>
-              <w:t xml:space="preserve">The till says the label printer did not answer</w:t>
+              <w:t xml:space="preserve">The POS says the label printer did not answer</w:t>
             </w:r>
           </w:p>
         </w:tc>
@@ -3682,7 +3682,7 @@
         <w:spacing w:after="60"/>
       </w:pPr>
       <w:r>
-        <w:t xml:space="preserve">At any till, tapping the item asks for the weight (a keypad in kg).</w:t>
+        <w:t xml:space="preserve">At any POS, tapping the item asks for the weight (a keypad in kg).</w:t>
       </w:r>
     </w:p>
     <w:p>

</xml_diff>